<commit_message>
Correct a self-introduced overclaim in the DDI threshold-calibration finding
A rerun consistency check found that Section 4.6.3's claim that
calibration "widens" the joint-vs-alternatives kappa gap only held for
EfficientNetB4: it actually narrows for ResNet-50 (0.189 -> 0.182) and
VGG-16 (0.233 -> 0.196) against fine-tuning, per Table 4.6 vs Table 4.13.
Replaced with the verified range across all six architecture-alternative
pairs (0.115 to 0.251 kappa, direction varies by pair, never closes) in
Chapter 4 Sections 4.6.3 and 4.7, and Chapter 5 Section 5.2.2. Also
tightened an ambiguous "overlaps... in full" phrase in Table 4.1b's
discussion that could misread as one CI fully containing another.

Co-Authored-By: Claude Sonnet 5 <noreply@anthropic.com>
Claude-Session: https://claude.ai/code/session_01YRRmU5DgynD221sGeBvwjN
</commit_message>
<xml_diff>
--- a/writing/chapter-4-results.docx
+++ b/writing/chapter-4-results.docx
@@ -913,7 +913,7 @@
           <w:rFonts w:ascii="Times New Roman" w:hAnsi="Times New Roman"/>
           <w:sz w:val="24"/>
         </w:rPr>
-        <w:t>All three architectures' confidence intervals overlap substantially, on both accuracy and kappa. ResNet-50's point estimate leads on both metrics, as reported above, but its interval overlaps both VGG-16's and EfficientNetB4's in full, and VGG-16's and EfficientNetB4's intervals overlap each other too. Table 4.1's ranking should therefore be read as the best point estimate available from this single validation run, not as a statistically confirmed ordering: at 1,490 validation images, the seven-class task is not large enough for the observed differences between architectures to clear the bar of non-overlapping confidence intervals. This qualifies every subsequent reference in this dissertation to ResNet-50 "leading" or "achieving the highest" seven-class performance; the point estimate is real and is the best available estimate, but it is not a claim that a different validation sample could not have shown a different architecture ahead.</w:t>
+        <w:t>All three architectures' confidence intervals overlap, on both accuracy and kappa. ResNet-50's point estimate leads on both metrics, as reported above, but its interval overlaps both VGG-16's and EfficientNetB4's, and VGG-16's and EfficientNetB4's intervals overlap each other too. Table 4.1's ranking should therefore be read as the best point estimate available from this single validation run, not as a statistically confirmed ordering: at 1,490 validation images, the seven-class task is not large enough for the observed differences between architectures to clear the bar of non-overlapping confidence intervals. This qualifies every subsequent reference in this dissertation to ResNet-50 "leading" or "achieving the highest" seven-class performance; the point estimate is real and is the best available estimate, but it is not a claim that a different validation sample could not have shown a different architecture ahead.</w:t>
       </w:r>
     </w:p>
     <w:p>
@@ -7373,7 +7373,7 @@
           <w:rFonts w:ascii="Times New Roman" w:hAnsi="Times New Roman"/>
           <w:sz w:val="24"/>
         </w:rPr>
-        <w:t>Joint training remains clearly ahead of both alternatives for every architecture even once every strategy is given its own fairest threshold; if anything, the gap between joint and the alternatives widens compared with the uncalibrated comparison in Table 4.6. This rules out an uncalibrated default threshold as the explanation for joint training's advantage: the advantage reflects a genuine difference in each model's underlying discrimination ability, not an artefact of where the decision boundary happened to sit by default.</w:t>
+        <w:t>Joint training remains clearly ahead of both alternatives for every architecture even once every strategy is given its own fairest threshold: across the six architecture-alternative pairs in Table 4.13, the calibrated gap ranges from 0.115 to 0.251 kappa, narrower than the corresponding uncalibrated gap in some cases (for instance ResNet-50 versus fine-tuned, and VGG-16 versus either alternative) and wider in others (for instance EfficientNetB4 versus either alternative), but it does not close or reverse for any architecture. This rules out an uncalibrated default threshold as the explanation for joint training's advantage: the advantage reflects a genuine difference in each model's underlying discrimination ability, not an artefact of where the decision boundary happened to sit by default.</w:t>
       </w:r>
     </w:p>
     <w:p>
@@ -7774,7 +7774,7 @@
           <w:rFonts w:ascii="Times New Roman" w:hAnsi="Times New Roman"/>
           <w:sz w:val="24"/>
         </w:rPr>
-        <w:t>Across all three DDI incorporation strategies, joint training produced the highest kappa on the DDI held-out split for every architecture, by a substantial margin over sequential fine-tuning in every case. Zero-shot evaluation on the full DDI set showed a severe collapse in malignant recall for every architecture, of differing sizes, with EfficientNetB4 retaining the most malignant recall despite being the weakest architecture by several other measures. Four robustness checks on this comparison (Section 4.6) converge on the same directionally consistent picture: joint training's advantage survives calibrating every strategy to its own fairest threshold, and if anything widens; the resulting architecture ranking, ResNet-50 and VGG-16 both ahead of EfficientNetB4, held stable across three independently trained models, though the ResNet-50-versus-VGG-16 gap specifically was small enough in one of those three seeds to be read as a near-tie rather than a confident distinction; and DDI's 99-image held-out split is the dominant source of uncertainty in these figures, large enough that no formal paired significance test run on this dataset reaches significance at the conventional threshold, even though every other check points the same direction.</w:t>
+        <w:t>Across all three DDI incorporation strategies, joint training produced the highest kappa on the DDI held-out split for every architecture, by a substantial margin over sequential fine-tuning in every case. Zero-shot evaluation on the full DDI set showed a severe collapse in malignant recall for every architecture, of differing sizes, with EfficientNetB4 retaining the most malignant recall despite being the weakest architecture by several other measures. Four robustness checks on this comparison (Section 4.6) converge on the same directionally consistent picture: joint training's advantage survives calibrating every strategy to its own fairest threshold and does not close for any architecture, though whether the exact margin widens or narrows under calibration varies by architecture and by which alternative it is compared against; the resulting architecture ranking, ResNet-50 and VGG-16 both ahead of EfficientNetB4, held stable across three independently trained models, though the ResNet-50-versus-VGG-16 gap specifically was small enough in one of those three seeds to be read as a near-tie rather than a confident distinction; and DDI's 99-image held-out split is the dominant source of uncertainty in these figures, large enough that no formal paired significance test run on this dataset reaches significance at the conventional threshold, even though every other check points the same direction.</w:t>
       </w:r>
     </w:p>
     <w:p>

</xml_diff>